<commit_message>
Add Arabic client report and presentation
Co-authored-by: Copilot <223556219+Copilot@users.noreply.github.com>
</commit_message>
<xml_diff>
--- a/reports/client_report.docx
+++ b/reports/client_report.docx
@@ -135,7 +135,7 @@
         <w:shd w:val="clear" w:color="auto" w:fill="EEF4FA"/>
         <w:bidi/>
         <w:spacing w:before="120" w:after="240" w:line="336" w:lineRule="auto"/>
-        <w:ind w:left="200" w:right="200"/>
+        <w:ind w:right="200"/>
         <w:rPr>
           <w:rFonts w:ascii="Arial" w:eastAsia="Times New Roman" w:hAnsi="Arial" w:cs="Arial"/>
           <w:color w:val="262626"/>
@@ -875,7 +875,7 @@
           <w:szCs w:val="24"/>
         </w:rPr>
         <w:drawing>
-          <wp:inline distT="0" distB="0" distL="0" distR="0" wp14:anchorId="5E6372C5" wp14:editId="07F63618">
+          <wp:inline distT="0" distB="0" distL="0" distR="0" wp14:anchorId="5E6372C5" wp14:editId="5D24EC44">
             <wp:extent cx="4975860" cy="2484120"/>
             <wp:effectExtent l="0" t="0" r="0" b="0"/>
             <wp:docPr id="122906624" name="Picture 5" descr="الشكل 1: تغير إجمالي الطلب أسبوعيًا. يوضح الرسم تفاوت إجمالي الطلب بين الأسابيع المرصودة، مع إبراز أعلى أسبوع وأدناه. أرقام الأسابيع ليست تواريخ تقويمية."/>
@@ -887,565 +887,6 @@
                 <pic:pic xmlns:pic="http://schemas.openxmlformats.org/drawingml/2006/picture">
                   <pic:nvPicPr>
                     <pic:cNvPr id="0" name="الشكل 1" descr="الشكل 1: تغير إجمالي الطلب أسبوعيًا. يوضح الرسم تفاوت إجمالي الطلب بين الأسابيع المرصودة، مع إبراز أعلى أسبوع وأدناه. أرقام الأسابيع ليست تواريخ تقويمية."/>
-                    <pic:cNvPicPr>
-                      <a:picLocks noChangeAspect="1" noChangeArrowheads="1"/>
-                    </pic:cNvPicPr>
-                  </pic:nvPicPr>
-                  <pic:blipFill>
-                    <a:blip r:embed="rId5" cstate="print">
-                      <a:extLst>
-                        <a:ext uri="{28A0092B-C50C-407E-A947-70E740481C1C}">
-                          <a14:useLocalDpi xmlns:a14="http://schemas.microsoft.com/office/drawing/2010/main" val="0"/>
-                        </a:ext>
-                      </a:extLst>
-                    </a:blip>
-                    <a:srcRect/>
-                    <a:stretch>
-                      <a:fillRect/>
-                    </a:stretch>
-                  </pic:blipFill>
-                  <pic:spPr bwMode="auto">
-                    <a:xfrm>
-                      <a:off x="0" y="0"/>
-                      <a:ext cx="4975860" cy="2484120"/>
-                    </a:xfrm>
-                    <a:prstGeom prst="rect">
-                      <a:avLst/>
-                    </a:prstGeom>
-                    <a:noFill/>
-                    <a:ln>
-                      <a:noFill/>
-                    </a:ln>
-                  </pic:spPr>
-                </pic:pic>
-              </a:graphicData>
-            </a:graphic>
-          </wp:inline>
-        </w:drawing>
-      </w:r>
-    </w:p>
-    <w:p>
-      <w:pPr>
-        <w:keepLines/>
-        <w:bidi/>
-        <w:spacing w:before="60" w:after="300" w:line="300" w:lineRule="auto"/>
-        <w:rPr>
-          <w:rFonts w:ascii="Arial" w:eastAsia="Times New Roman" w:hAnsi="Arial" w:cs="Arial"/>
-          <w:color w:val="595959"/>
-        </w:rPr>
-      </w:pPr>
-      <w:r>
-        <w:rPr>
-          <w:rFonts w:ascii="Arial" w:eastAsia="Times New Roman" w:hAnsi="Arial" w:cs="Arial"/>
-          <w:b/>
-          <w:bCs/>
-          <w:color w:val="1F3A5F"/>
-          <w:rtl/>
-        </w:rPr>
-        <w:t xml:space="preserve">الشكل </w:t>
-      </w:r>
-      <w:r>
-        <w:rPr>
-          <w:rFonts w:ascii="Arial" w:eastAsia="Times New Roman" w:hAnsi="Arial" w:cs="Arial"/>
-          <w:b/>
-          <w:bCs/>
-          <w:color w:val="1F3A5F"/>
-        </w:rPr>
-        <w:t xml:space="preserve">1: </w:t>
-      </w:r>
-      <w:r>
-        <w:rPr>
-          <w:rFonts w:ascii="Arial" w:eastAsia="Times New Roman" w:hAnsi="Arial" w:cs="Arial"/>
-          <w:b/>
-          <w:bCs/>
-          <w:color w:val="1F3A5F"/>
-          <w:rtl/>
-        </w:rPr>
-        <w:t>تغير إجمالي الطلب أسبوعيًا</w:t>
-      </w:r>
-      <w:r>
-        <w:rPr>
-          <w:rFonts w:ascii="Arial" w:eastAsia="Times New Roman" w:hAnsi="Arial" w:cs="Arial"/>
-          <w:b/>
-          <w:bCs/>
-          <w:color w:val="1F3A5F"/>
-        </w:rPr>
-        <w:t>.</w:t>
-      </w:r>
-      <w:r>
-        <w:rPr>
-          <w:rFonts w:ascii="Arial" w:eastAsia="Times New Roman" w:hAnsi="Arial" w:cs="Arial"/>
-          <w:color w:val="595959"/>
-          <w:rtl/>
-        </w:rPr>
-        <w:t xml:space="preserve"> يوضح الرسم تفاوت إجمالي الطلب بين الأسابيع المرصودة، مع إبراز أعلى أسبوع وأدناه</w:t>
-      </w:r>
-      <w:r>
-        <w:rPr>
-          <w:rFonts w:ascii="Arial" w:eastAsia="Times New Roman" w:hAnsi="Arial" w:cs="Arial"/>
-          <w:color w:val="595959"/>
-        </w:rPr>
-        <w:t xml:space="preserve">. </w:t>
-      </w:r>
-      <w:r>
-        <w:rPr>
-          <w:rFonts w:ascii="Arial" w:eastAsia="Times New Roman" w:hAnsi="Arial" w:cs="Arial"/>
-          <w:color w:val="595959"/>
-          <w:rtl/>
-        </w:rPr>
-        <w:t>أرقام الأسابيع ليست تواريخ تقويمية</w:t>
-      </w:r>
-      <w:r>
-        <w:rPr>
-          <w:rFonts w:ascii="Arial" w:eastAsia="Times New Roman" w:hAnsi="Arial" w:cs="Arial"/>
-          <w:color w:val="595959"/>
-        </w:rPr>
-        <w:t>.</w:t>
-      </w:r>
-    </w:p>
-    <w:p>
-      <w:pPr>
-        <w:keepNext/>
-        <w:keepLines/>
-        <w:bidi/>
-        <w:spacing w:before="320" w:after="100" w:line="320" w:lineRule="auto"/>
-        <w:outlineLvl w:val="1"/>
-        <w:rPr>
-          <w:rFonts w:ascii="Arial" w:eastAsia="Times New Roman" w:hAnsi="Arial" w:cs="Arial"/>
-          <w:b/>
-          <w:bCs/>
-          <w:color w:val="2E75B6"/>
-          <w:sz w:val="30"/>
-          <w:szCs w:val="30"/>
-        </w:rPr>
-      </w:pPr>
-      <w:r>
-        <w:rPr>
-          <w:rFonts w:ascii="Arial" w:eastAsia="Times New Roman" w:hAnsi="Arial" w:cs="Arial"/>
-          <w:b/>
-          <w:bCs/>
-          <w:color w:val="2E75B6"/>
-          <w:sz w:val="30"/>
-          <w:szCs w:val="30"/>
-        </w:rPr>
-        <w:lastRenderedPageBreak/>
-        <w:t xml:space="preserve">2. </w:t>
-      </w:r>
-      <w:r>
-        <w:rPr>
-          <w:rFonts w:ascii="Arial" w:eastAsia="Times New Roman" w:hAnsi="Arial" w:cs="Arial"/>
-          <w:b/>
-          <w:bCs/>
-          <w:color w:val="2E75B6"/>
-          <w:sz w:val="30"/>
-          <w:szCs w:val="30"/>
-          <w:rtl/>
-        </w:rPr>
-        <w:t>تركّز الطلب في فئات محددة</w:t>
-      </w:r>
-    </w:p>
-    <w:p>
-      <w:pPr>
-        <w:bidi/>
-        <w:spacing w:after="120" w:line="336" w:lineRule="auto"/>
-        <w:rPr>
-          <w:rFonts w:ascii="Arial" w:eastAsia="Times New Roman" w:hAnsi="Arial" w:cs="Arial"/>
-          <w:color w:val="262626"/>
-          <w:sz w:val="24"/>
-          <w:szCs w:val="24"/>
-        </w:rPr>
-      </w:pPr>
-      <w:r>
-        <w:rPr>
-          <w:rFonts w:ascii="Arial" w:eastAsia="Times New Roman" w:hAnsi="Arial" w:cs="Arial"/>
-          <w:color w:val="262626"/>
-          <w:sz w:val="24"/>
-          <w:szCs w:val="24"/>
-          <w:rtl/>
-        </w:rPr>
-        <w:t xml:space="preserve">استحوذت أكبر ثلاث فئات على </w:t>
-      </w:r>
-      <w:r>
-        <w:rPr>
-          <w:rFonts w:ascii="Arial" w:eastAsia="Times New Roman" w:hAnsi="Arial" w:cs="Arial"/>
-          <w:color w:val="262626"/>
-          <w:sz w:val="24"/>
-          <w:szCs w:val="24"/>
-        </w:rPr>
-        <w:t xml:space="preserve">66.07% </w:t>
-      </w:r>
-      <w:r>
-        <w:rPr>
-          <w:rFonts w:ascii="Arial" w:eastAsia="Times New Roman" w:hAnsi="Arial" w:cs="Arial"/>
-          <w:color w:val="262626"/>
-          <w:sz w:val="24"/>
-          <w:szCs w:val="24"/>
-          <w:rtl/>
-        </w:rPr>
-        <w:t>من الطلبات</w:t>
-      </w:r>
-      <w:r>
-        <w:rPr>
-          <w:rFonts w:ascii="Arial" w:eastAsia="Times New Roman" w:hAnsi="Arial" w:cs="Arial"/>
-          <w:color w:val="262626"/>
-          <w:sz w:val="24"/>
-          <w:szCs w:val="24"/>
-        </w:rPr>
-        <w:t xml:space="preserve">. </w:t>
-      </w:r>
-      <w:r>
-        <w:rPr>
-          <w:rFonts w:ascii="Arial" w:eastAsia="Times New Roman" w:hAnsi="Arial" w:cs="Arial"/>
-          <w:color w:val="262626"/>
-          <w:sz w:val="24"/>
-          <w:szCs w:val="24"/>
-          <w:rtl/>
-        </w:rPr>
-        <w:t xml:space="preserve">وسجلت فئة المشروبات </w:t>
-      </w:r>
-      <w:r>
-        <w:rPr>
-          <w:rFonts w:ascii="Arial" w:eastAsia="Times New Roman" w:hAnsi="Arial" w:cs="Arial"/>
-          <w:color w:val="262626"/>
-          <w:sz w:val="24"/>
-          <w:szCs w:val="24"/>
-        </w:rPr>
-        <w:t xml:space="preserve">40,480,525 </w:t>
-      </w:r>
-      <w:r>
-        <w:rPr>
-          <w:rFonts w:ascii="Arial" w:eastAsia="Times New Roman" w:hAnsi="Arial" w:cs="Arial"/>
-          <w:color w:val="262626"/>
-          <w:sz w:val="24"/>
-          <w:szCs w:val="24"/>
-          <w:rtl/>
-        </w:rPr>
-        <w:t xml:space="preserve">طلبًا </w:t>
-      </w:r>
-      <w:r>
-        <w:rPr>
-          <w:rFonts w:ascii="Arial" w:eastAsia="Times New Roman" w:hAnsi="Arial" w:cs="Arial"/>
-          <w:color w:val="262626"/>
-          <w:sz w:val="24"/>
-          <w:szCs w:val="24"/>
-        </w:rPr>
-        <w:t xml:space="preserve">(33.86% </w:t>
-      </w:r>
-      <w:r>
-        <w:rPr>
-          <w:rFonts w:ascii="Arial" w:eastAsia="Times New Roman" w:hAnsi="Arial" w:cs="Arial"/>
-          <w:color w:val="262626"/>
-          <w:sz w:val="24"/>
-          <w:szCs w:val="24"/>
-          <w:rtl/>
-        </w:rPr>
-        <w:t>من الإجمالي</w:t>
-      </w:r>
-      <w:r>
-        <w:rPr>
-          <w:rFonts w:ascii="Arial" w:eastAsia="Times New Roman" w:hAnsi="Arial" w:cs="Arial"/>
-          <w:color w:val="262626"/>
-          <w:sz w:val="24"/>
-          <w:szCs w:val="24"/>
-        </w:rPr>
-        <w:t>)</w:t>
-      </w:r>
-      <w:r>
-        <w:rPr>
-          <w:rFonts w:ascii="Arial" w:eastAsia="Times New Roman" w:hAnsi="Arial" w:cs="Arial"/>
-          <w:color w:val="262626"/>
-          <w:sz w:val="24"/>
-          <w:szCs w:val="24"/>
-          <w:rtl/>
-        </w:rPr>
-        <w:t>، ما يجعل متابعة هذه الفئات مفيدة عند ترتيب أولويات مراجعة التوقعات</w:t>
-      </w:r>
-      <w:r>
-        <w:rPr>
-          <w:rFonts w:ascii="Arial" w:eastAsia="Times New Roman" w:hAnsi="Arial" w:cs="Arial"/>
-          <w:color w:val="262626"/>
-          <w:sz w:val="24"/>
-          <w:szCs w:val="24"/>
-        </w:rPr>
-        <w:t>.</w:t>
-      </w:r>
-    </w:p>
-    <w:p>
-      <w:pPr>
-        <w:keepNext/>
-        <w:bidi/>
-        <w:spacing w:before="160" w:after="0" w:line="240" w:lineRule="auto"/>
-        <w:rPr>
-          <w:rFonts w:ascii="Arial" w:eastAsia="Times New Roman" w:hAnsi="Arial" w:cs="Arial"/>
-          <w:color w:val="262626"/>
-          <w:sz w:val="24"/>
-          <w:szCs w:val="24"/>
-        </w:rPr>
-      </w:pPr>
-      <w:r>
-        <w:rPr>
-          <w:rFonts w:ascii="Arial" w:eastAsia="Times New Roman" w:hAnsi="Arial" w:cs="Arial"/>
-          <w:noProof/>
-          <w:color w:val="262626"/>
-          <w:sz w:val="24"/>
-          <w:szCs w:val="24"/>
-        </w:rPr>
-        <w:drawing>
-          <wp:inline distT="0" distB="0" distL="0" distR="0" wp14:anchorId="2836D492" wp14:editId="09BBE2BE">
-            <wp:extent cx="4975860" cy="2484120"/>
-            <wp:effectExtent l="0" t="0" r="0" b="0"/>
-            <wp:docPr id="678094022" name="Picture 4" descr="الشكل 2: أكثر فئات الوجبات طلبًا. تقارن الأعمدة إجمالي الطلبات في أكبر فئات الوجبات، وتظهر تصدّر المشروبات ضمن الفئات المعروضة."/>
-            <wp:cNvGraphicFramePr>
-              <a:graphicFrameLocks xmlns:a="http://schemas.openxmlformats.org/drawingml/2006/main" noChangeAspect="1"/>
-            </wp:cNvGraphicFramePr>
-            <a:graphic xmlns:a="http://schemas.openxmlformats.org/drawingml/2006/main">
-              <a:graphicData uri="http://schemas.openxmlformats.org/drawingml/2006/picture">
-                <pic:pic xmlns:pic="http://schemas.openxmlformats.org/drawingml/2006/picture">
-                  <pic:nvPicPr>
-                    <pic:cNvPr id="0" name="الشكل 2" descr="الشكل 2: أكثر فئات الوجبات طلبًا. تقارن الأعمدة إجمالي الطلبات في أكبر فئات الوجبات، وتظهر تصدّر المشروبات ضمن الفئات المعروضة."/>
-                    <pic:cNvPicPr>
-                      <a:picLocks noChangeAspect="1" noChangeArrowheads="1"/>
-                    </pic:cNvPicPr>
-                  </pic:nvPicPr>
-                  <pic:blipFill>
-                    <a:blip r:embed="rId6" cstate="print">
-                      <a:extLst>
-                        <a:ext uri="{28A0092B-C50C-407E-A947-70E740481C1C}">
-                          <a14:useLocalDpi xmlns:a14="http://schemas.microsoft.com/office/drawing/2010/main" val="0"/>
-                        </a:ext>
-                      </a:extLst>
-                    </a:blip>
-                    <a:srcRect/>
-                    <a:stretch>
-                      <a:fillRect/>
-                    </a:stretch>
-                  </pic:blipFill>
-                  <pic:spPr bwMode="auto">
-                    <a:xfrm>
-                      <a:off x="0" y="0"/>
-                      <a:ext cx="4975860" cy="2484120"/>
-                    </a:xfrm>
-                    <a:prstGeom prst="rect">
-                      <a:avLst/>
-                    </a:prstGeom>
-                    <a:noFill/>
-                    <a:ln>
-                      <a:noFill/>
-                    </a:ln>
-                  </pic:spPr>
-                </pic:pic>
-              </a:graphicData>
-            </a:graphic>
-          </wp:inline>
-        </w:drawing>
-      </w:r>
-    </w:p>
-    <w:p>
-      <w:pPr>
-        <w:keepLines/>
-        <w:bidi/>
-        <w:spacing w:before="60" w:after="300" w:line="300" w:lineRule="auto"/>
-        <w:rPr>
-          <w:rFonts w:ascii="Arial" w:eastAsia="Times New Roman" w:hAnsi="Arial" w:cs="Arial"/>
-          <w:color w:val="595959"/>
-        </w:rPr>
-      </w:pPr>
-      <w:r>
-        <w:rPr>
-          <w:rFonts w:ascii="Arial" w:eastAsia="Times New Roman" w:hAnsi="Arial" w:cs="Arial"/>
-          <w:b/>
-          <w:bCs/>
-          <w:color w:val="1F3A5F"/>
-          <w:rtl/>
-        </w:rPr>
-        <w:t xml:space="preserve">الشكل </w:t>
-      </w:r>
-      <w:r>
-        <w:rPr>
-          <w:rFonts w:ascii="Arial" w:eastAsia="Times New Roman" w:hAnsi="Arial" w:cs="Arial"/>
-          <w:b/>
-          <w:bCs/>
-          <w:color w:val="1F3A5F"/>
-        </w:rPr>
-        <w:t xml:space="preserve">2: </w:t>
-      </w:r>
-      <w:r>
-        <w:rPr>
-          <w:rFonts w:ascii="Arial" w:eastAsia="Times New Roman" w:hAnsi="Arial" w:cs="Arial"/>
-          <w:b/>
-          <w:bCs/>
-          <w:color w:val="1F3A5F"/>
-          <w:rtl/>
-        </w:rPr>
-        <w:t>أكثر فئات الوجبات طلبًا</w:t>
-      </w:r>
-      <w:r>
-        <w:rPr>
-          <w:rFonts w:ascii="Arial" w:eastAsia="Times New Roman" w:hAnsi="Arial" w:cs="Arial"/>
-          <w:b/>
-          <w:bCs/>
-          <w:color w:val="1F3A5F"/>
-        </w:rPr>
-        <w:t>.</w:t>
-      </w:r>
-      <w:r>
-        <w:rPr>
-          <w:rFonts w:ascii="Arial" w:eastAsia="Times New Roman" w:hAnsi="Arial" w:cs="Arial"/>
-          <w:color w:val="595959"/>
-          <w:rtl/>
-        </w:rPr>
-        <w:t xml:space="preserve"> تقارن الأعمدة إجمالي الطلبات في أكبر فئات الوجبات، وتظهر تصدّر المشروبات ضمن الفئات المعروضة</w:t>
-      </w:r>
-      <w:r>
-        <w:rPr>
-          <w:rFonts w:ascii="Arial" w:eastAsia="Times New Roman" w:hAnsi="Arial" w:cs="Arial"/>
-          <w:color w:val="595959"/>
-        </w:rPr>
-        <w:t>.</w:t>
-      </w:r>
-    </w:p>
-    <w:p>
-      <w:pPr>
-        <w:keepNext/>
-        <w:keepLines/>
-        <w:bidi/>
-        <w:spacing w:before="320" w:after="100" w:line="320" w:lineRule="auto"/>
-        <w:outlineLvl w:val="1"/>
-        <w:rPr>
-          <w:rFonts w:ascii="Arial" w:eastAsia="Times New Roman" w:hAnsi="Arial" w:cs="Arial"/>
-          <w:b/>
-          <w:bCs/>
-          <w:color w:val="2E75B6"/>
-          <w:sz w:val="30"/>
-          <w:szCs w:val="30"/>
-        </w:rPr>
-      </w:pPr>
-      <w:r>
-        <w:rPr>
-          <w:rFonts w:ascii="Arial" w:eastAsia="Times New Roman" w:hAnsi="Arial" w:cs="Arial"/>
-          <w:b/>
-          <w:bCs/>
-          <w:color w:val="2E75B6"/>
-          <w:sz w:val="30"/>
-          <w:szCs w:val="30"/>
-        </w:rPr>
-        <w:t xml:space="preserve">3. </w:t>
-      </w:r>
-      <w:r>
-        <w:rPr>
-          <w:rFonts w:ascii="Arial" w:eastAsia="Times New Roman" w:hAnsi="Arial" w:cs="Arial"/>
-          <w:b/>
-          <w:bCs/>
-          <w:color w:val="2E75B6"/>
-          <w:sz w:val="30"/>
-          <w:szCs w:val="30"/>
-          <w:rtl/>
-        </w:rPr>
-        <w:t>اختلافات وصفية بين أنواع المراكز</w:t>
-      </w:r>
-    </w:p>
-    <w:p>
-      <w:pPr>
-        <w:bidi/>
-        <w:spacing w:after="120" w:line="336" w:lineRule="auto"/>
-        <w:rPr>
-          <w:rFonts w:ascii="Arial" w:eastAsia="Times New Roman" w:hAnsi="Arial" w:cs="Arial"/>
-          <w:color w:val="262626"/>
-          <w:sz w:val="24"/>
-          <w:szCs w:val="24"/>
-        </w:rPr>
-      </w:pPr>
-      <w:r>
-        <w:rPr>
-          <w:rFonts w:ascii="Arial" w:eastAsia="Times New Roman" w:hAnsi="Arial" w:cs="Arial"/>
-          <w:color w:val="262626"/>
-          <w:sz w:val="24"/>
-          <w:szCs w:val="24"/>
-          <w:rtl/>
-        </w:rPr>
-        <w:t xml:space="preserve">يعرض الرسم متوسط إجمالي الطلب لكل مركز بحسب نوعه، ويظهر </w:t>
-      </w:r>
-      <w:r>
-        <w:rPr>
-          <w:rFonts w:ascii="Arial" w:eastAsia="Times New Roman" w:hAnsi="Arial" w:cs="Arial"/>
-          <w:color w:val="262626"/>
-          <w:sz w:val="24"/>
-          <w:szCs w:val="24"/>
-        </w:rPr>
-        <w:t xml:space="preserve">TYPE_B </w:t>
-      </w:r>
-      <w:r>
-        <w:rPr>
-          <w:rFonts w:ascii="Arial" w:eastAsia="Times New Roman" w:hAnsi="Arial" w:cs="Arial"/>
-          <w:color w:val="262626"/>
-          <w:sz w:val="24"/>
-          <w:szCs w:val="24"/>
-          <w:rtl/>
-        </w:rPr>
-        <w:t>أعلى متوسط بين الأنواع المعروضة</w:t>
-      </w:r>
-      <w:r>
-        <w:rPr>
-          <w:rFonts w:ascii="Arial" w:eastAsia="Times New Roman" w:hAnsi="Arial" w:cs="Arial"/>
-          <w:color w:val="262626"/>
-          <w:sz w:val="24"/>
-          <w:szCs w:val="24"/>
-        </w:rPr>
-        <w:t xml:space="preserve">. </w:t>
-      </w:r>
-      <w:r>
-        <w:rPr>
-          <w:rFonts w:ascii="Arial" w:eastAsia="Times New Roman" w:hAnsi="Arial" w:cs="Arial"/>
-          <w:color w:val="262626"/>
-          <w:sz w:val="24"/>
-          <w:szCs w:val="24"/>
-          <w:rtl/>
-        </w:rPr>
-        <w:t>هذا وصف للمراكز في البيانات المتاحة ولا يحدد سبب الفروق أو يثبت أن نوع المركز هو العامل المؤثر</w:t>
-      </w:r>
-      <w:r>
-        <w:rPr>
-          <w:rFonts w:ascii="Arial" w:eastAsia="Times New Roman" w:hAnsi="Arial" w:cs="Arial"/>
-          <w:color w:val="262626"/>
-          <w:sz w:val="24"/>
-          <w:szCs w:val="24"/>
-        </w:rPr>
-        <w:t>.</w:t>
-      </w:r>
-    </w:p>
-    <w:p>
-      <w:pPr>
-        <w:keepNext/>
-        <w:bidi/>
-        <w:spacing w:before="160" w:after="0" w:line="240" w:lineRule="auto"/>
-        <w:rPr>
-          <w:rFonts w:ascii="Arial" w:eastAsia="Times New Roman" w:hAnsi="Arial" w:cs="Arial"/>
-          <w:color w:val="262626"/>
-          <w:sz w:val="24"/>
-          <w:szCs w:val="24"/>
-        </w:rPr>
-      </w:pPr>
-      <w:r>
-        <w:rPr>
-          <w:rFonts w:ascii="Arial" w:eastAsia="Times New Roman" w:hAnsi="Arial" w:cs="Arial"/>
-          <w:noProof/>
-          <w:color w:val="262626"/>
-          <w:sz w:val="24"/>
-          <w:szCs w:val="24"/>
-        </w:rPr>
-        <w:drawing>
-          <wp:inline distT="0" distB="0" distL="0" distR="0" wp14:anchorId="5A85B92F" wp14:editId="50528B6E">
-            <wp:extent cx="4975860" cy="2484120"/>
-            <wp:effectExtent l="0" t="0" r="0" b="0"/>
-            <wp:docPr id="1034073665" name="Picture 3" descr="الشكل 3: متوسط إجمالي الطلب حسب نوع المركز. يعرض الرسم متوسط الطلب التراكمي لكل مركز حسب نوعه؛ وهو وصف للبيانات وليس تفسيرًا لسبب الاختلاف."/>
-            <wp:cNvGraphicFramePr>
-              <a:graphicFrameLocks xmlns:a="http://schemas.openxmlformats.org/drawingml/2006/main" noChangeAspect="1"/>
-            </wp:cNvGraphicFramePr>
-            <a:graphic xmlns:a="http://schemas.openxmlformats.org/drawingml/2006/main">
-              <a:graphicData uri="http://schemas.openxmlformats.org/drawingml/2006/picture">
-                <pic:pic xmlns:pic="http://schemas.openxmlformats.org/drawingml/2006/picture">
-                  <pic:nvPicPr>
-                    <pic:cNvPr id="0" name="الشكل 3" descr="الشكل 3: متوسط إجمالي الطلب حسب نوع المركز. يعرض الرسم متوسط الطلب التراكمي لكل مركز حسب نوعه؛ وهو وصف للبيانات وليس تفسيرًا لسبب الاختلاف."/>
                     <pic:cNvPicPr>
                       <a:picLocks noChangeAspect="1" noChangeArrowheads="1"/>
                     </pic:cNvPicPr>
@@ -1510,7 +951,7 @@
           <w:bCs/>
           <w:color w:val="1F3A5F"/>
         </w:rPr>
-        <w:t xml:space="preserve">3: </w:t>
+        <w:t xml:space="preserve">1: </w:t>
       </w:r>
       <w:r>
         <w:rPr>
@@ -1520,7 +961,7 @@
           <w:color w:val="1F3A5F"/>
           <w:rtl/>
         </w:rPr>
-        <w:t>متوسط إجمالي الطلب حسب نوع المركز</w:t>
+        <w:t>تغير إجمالي الطلب أسبوعيًا</w:t>
       </w:r>
       <w:r>
         <w:rPr>
@@ -1537,7 +978,22 @@
           <w:color w:val="595959"/>
           <w:rtl/>
         </w:rPr>
-        <w:t xml:space="preserve"> يعرض الرسم متوسط الطلب التراكمي لكل مركز حسب نوعه؛ وهو وصف للبيانات وليس تفسيرًا لسبب الاختلاف</w:t>
+        <w:t xml:space="preserve"> يوضح الرسم تفاوت إجمالي الطلب بين الأسابيع المرصودة، مع إبراز أعلى أسبوع وأدناه</w:t>
+      </w:r>
+      <w:r>
+        <w:rPr>
+          <w:rFonts w:ascii="Arial" w:eastAsia="Times New Roman" w:hAnsi="Arial" w:cs="Arial"/>
+          <w:color w:val="595959"/>
+        </w:rPr>
+        <w:t xml:space="preserve">. </w:t>
+      </w:r>
+      <w:r>
+        <w:rPr>
+          <w:rFonts w:ascii="Arial" w:eastAsia="Times New Roman" w:hAnsi="Arial" w:cs="Arial"/>
+          <w:color w:val="595959"/>
+          <w:rtl/>
+        </w:rPr>
+        <w:t>أرقام الأسابيع ليست تواريخ تقويمية</w:t>
       </w:r>
       <w:r>
         <w:rPr>
@@ -1573,7 +1029,7 @@
           <w:szCs w:val="30"/>
         </w:rPr>
         <w:lastRenderedPageBreak/>
-        <w:t xml:space="preserve">4. </w:t>
+        <w:t xml:space="preserve">2. </w:t>
       </w:r>
       <w:r>
         <w:rPr>
@@ -1585,7 +1041,7 @@
           <w:szCs w:val="30"/>
           <w:rtl/>
         </w:rPr>
-        <w:t>الترويج والطلبات</w:t>
+        <w:t>تركّز الطلب في فئات محددة</w:t>
       </w:r>
     </w:p>
     <w:p>
@@ -1607,83 +1063,26 @@
           <w:szCs w:val="24"/>
           <w:rtl/>
         </w:rPr>
-        <w:t xml:space="preserve">في المقارنات المطابقة للمركز والوجبة، كان وسيط الطلبات مع الترويج بالبريد </w:t>
-      </w:r>
-      <w:r>
-        <w:rPr>
-          <w:rFonts w:ascii="Arial" w:eastAsia="Times New Roman" w:hAnsi="Arial" w:cs="Arial"/>
-          <w:color w:val="262626"/>
-          <w:sz w:val="24"/>
-          <w:szCs w:val="24"/>
-        </w:rPr>
-        <w:t xml:space="preserve">325 </w:t>
-      </w:r>
-      <w:r>
-        <w:rPr>
-          <w:rFonts w:ascii="Arial" w:eastAsia="Times New Roman" w:hAnsi="Arial" w:cs="Arial"/>
-          <w:color w:val="262626"/>
-          <w:sz w:val="24"/>
-          <w:szCs w:val="24"/>
-          <w:rtl/>
-        </w:rPr>
-        <w:t xml:space="preserve">مقابل </w:t>
-      </w:r>
-      <w:r>
-        <w:rPr>
-          <w:rFonts w:ascii="Arial" w:eastAsia="Times New Roman" w:hAnsi="Arial" w:cs="Arial"/>
-          <w:color w:val="262626"/>
-          <w:sz w:val="24"/>
-          <w:szCs w:val="24"/>
-        </w:rPr>
-        <w:t xml:space="preserve">134 </w:t>
-      </w:r>
-      <w:r>
-        <w:rPr>
-          <w:rFonts w:ascii="Arial" w:eastAsia="Times New Roman" w:hAnsi="Arial" w:cs="Arial"/>
-          <w:color w:val="262626"/>
-          <w:sz w:val="24"/>
-          <w:szCs w:val="24"/>
-          <w:rtl/>
-        </w:rPr>
-        <w:t xml:space="preserve">من دونه، ومع الظهور في الصفحة الرئيسية </w:t>
-      </w:r>
-      <w:r>
-        <w:rPr>
-          <w:rFonts w:ascii="Arial" w:eastAsia="Times New Roman" w:hAnsi="Arial" w:cs="Arial"/>
-          <w:color w:val="262626"/>
-          <w:sz w:val="24"/>
-          <w:szCs w:val="24"/>
-        </w:rPr>
-        <w:t xml:space="preserve">311 </w:t>
-      </w:r>
-      <w:r>
-        <w:rPr>
-          <w:rFonts w:ascii="Arial" w:eastAsia="Times New Roman" w:hAnsi="Arial" w:cs="Arial"/>
-          <w:color w:val="262626"/>
-          <w:sz w:val="24"/>
-          <w:szCs w:val="24"/>
-          <w:rtl/>
-        </w:rPr>
-        <w:t xml:space="preserve">مقابل </w:t>
-      </w:r>
-      <w:r>
-        <w:rPr>
-          <w:rFonts w:ascii="Arial" w:eastAsia="Times New Roman" w:hAnsi="Arial" w:cs="Arial"/>
-          <w:color w:val="262626"/>
-          <w:sz w:val="24"/>
-          <w:szCs w:val="24"/>
-        </w:rPr>
-        <w:t xml:space="preserve">123 </w:t>
-      </w:r>
-      <w:r>
-        <w:rPr>
-          <w:rFonts w:ascii="Arial" w:eastAsia="Times New Roman" w:hAnsi="Arial" w:cs="Arial"/>
-          <w:color w:val="262626"/>
-          <w:sz w:val="24"/>
-          <w:szCs w:val="24"/>
-          <w:rtl/>
-        </w:rPr>
-        <w:t>من دونه</w:t>
+        <w:t xml:space="preserve">استحوذت أكبر ثلاث فئات على </w:t>
+      </w:r>
+      <w:r>
+        <w:rPr>
+          <w:rFonts w:ascii="Arial" w:eastAsia="Times New Roman" w:hAnsi="Arial" w:cs="Arial"/>
+          <w:color w:val="262626"/>
+          <w:sz w:val="24"/>
+          <w:szCs w:val="24"/>
+        </w:rPr>
+        <w:t xml:space="preserve">66.07% </w:t>
+      </w:r>
+      <w:r>
+        <w:rPr>
+          <w:rFonts w:ascii="Arial" w:eastAsia="Times New Roman" w:hAnsi="Arial" w:cs="Arial"/>
+          <w:color w:val="262626"/>
+          <w:sz w:val="24"/>
+          <w:szCs w:val="24"/>
+          <w:rtl/>
+        </w:rPr>
+        <w:t>من الطلبات</w:t>
       </w:r>
       <w:r>
         <w:rPr>
@@ -1702,64 +1101,64 @@
           <w:szCs w:val="24"/>
           <w:rtl/>
         </w:rPr>
-        <w:t xml:space="preserve">شملت المقارنة </w:t>
-      </w:r>
-      <w:r>
-        <w:rPr>
-          <w:rFonts w:ascii="Arial" w:eastAsia="Times New Roman" w:hAnsi="Arial" w:cs="Arial"/>
-          <w:color w:val="262626"/>
-          <w:sz w:val="24"/>
-          <w:szCs w:val="24"/>
-        </w:rPr>
-        <w:t xml:space="preserve">2830 </w:t>
-      </w:r>
-      <w:r>
-        <w:rPr>
-          <w:rFonts w:ascii="Arial" w:eastAsia="Times New Roman" w:hAnsi="Arial" w:cs="Arial"/>
-          <w:color w:val="262626"/>
-          <w:sz w:val="24"/>
-          <w:szCs w:val="24"/>
-          <w:rtl/>
-        </w:rPr>
-        <w:t>زوجًا للبريد و</w:t>
-      </w:r>
-      <w:r>
-        <w:rPr>
-          <w:rFonts w:ascii="Arial" w:eastAsia="Times New Roman" w:hAnsi="Arial" w:cs="Arial"/>
-          <w:color w:val="262626"/>
-          <w:sz w:val="24"/>
-          <w:szCs w:val="24"/>
-        </w:rPr>
-        <w:t xml:space="preserve">2928 </w:t>
-      </w:r>
-      <w:r>
-        <w:rPr>
-          <w:rFonts w:ascii="Arial" w:eastAsia="Times New Roman" w:hAnsi="Arial" w:cs="Arial"/>
-          <w:color w:val="262626"/>
-          <w:sz w:val="24"/>
-          <w:szCs w:val="24"/>
-          <w:rtl/>
-        </w:rPr>
-        <w:t>زوجًا للصفحة الرئيسية</w:t>
-      </w:r>
-      <w:r>
-        <w:rPr>
-          <w:rFonts w:ascii="Arial" w:eastAsia="Times New Roman" w:hAnsi="Arial" w:cs="Arial"/>
-          <w:color w:val="262626"/>
-          <w:sz w:val="24"/>
-          <w:szCs w:val="24"/>
-        </w:rPr>
-        <w:t xml:space="preserve">. </w:t>
-      </w:r>
-      <w:r>
-        <w:rPr>
-          <w:rFonts w:ascii="Arial" w:eastAsia="Times New Roman" w:hAnsi="Arial" w:cs="Arial"/>
-          <w:color w:val="262626"/>
-          <w:sz w:val="24"/>
-          <w:szCs w:val="24"/>
-          <w:rtl/>
-        </w:rPr>
-        <w:t>هذه ارتباطات وصفية؛ تكرار الأسابيع وعوامل أخرى محتملة يحدان من تفسيرها، ولا تثبت أن الترويج تسبب في الزيادة</w:t>
+        <w:t xml:space="preserve">وسجلت فئة المشروبات </w:t>
+      </w:r>
+      <w:r>
+        <w:rPr>
+          <w:rFonts w:ascii="Arial" w:eastAsia="Times New Roman" w:hAnsi="Arial" w:cs="Arial"/>
+          <w:color w:val="262626"/>
+          <w:sz w:val="24"/>
+          <w:szCs w:val="24"/>
+        </w:rPr>
+        <w:t xml:space="preserve">40,480,525 </w:t>
+      </w:r>
+      <w:r>
+        <w:rPr>
+          <w:rFonts w:ascii="Arial" w:eastAsia="Times New Roman" w:hAnsi="Arial" w:cs="Arial"/>
+          <w:color w:val="262626"/>
+          <w:sz w:val="24"/>
+          <w:szCs w:val="24"/>
+          <w:rtl/>
+        </w:rPr>
+        <w:t xml:space="preserve">طلبًا </w:t>
+      </w:r>
+      <w:r>
+        <w:rPr>
+          <w:rFonts w:ascii="Arial" w:eastAsia="Times New Roman" w:hAnsi="Arial" w:cs="Arial"/>
+          <w:color w:val="262626"/>
+          <w:sz w:val="24"/>
+          <w:szCs w:val="24"/>
+        </w:rPr>
+        <w:t xml:space="preserve">(33.86% </w:t>
+      </w:r>
+      <w:r>
+        <w:rPr>
+          <w:rFonts w:ascii="Arial" w:eastAsia="Times New Roman" w:hAnsi="Arial" w:cs="Arial"/>
+          <w:color w:val="262626"/>
+          <w:sz w:val="24"/>
+          <w:szCs w:val="24"/>
+          <w:rtl/>
+        </w:rPr>
+        <w:t>من الإجمالي</w:t>
+      </w:r>
+      <w:r>
+        <w:rPr>
+          <w:rFonts w:ascii="Arial" w:eastAsia="Times New Roman" w:hAnsi="Arial" w:cs="Arial"/>
+          <w:color w:val="262626"/>
+          <w:sz w:val="24"/>
+          <w:szCs w:val="24"/>
+        </w:rPr>
+        <w:t>)</w:t>
+      </w:r>
+      <w:r>
+        <w:rPr>
+          <w:rFonts w:ascii="Arial" w:eastAsia="Times New Roman" w:hAnsi="Arial" w:cs="Arial"/>
+          <w:color w:val="262626"/>
+          <w:sz w:val="24"/>
+          <w:szCs w:val="24"/>
+          <w:rtl/>
+        </w:rPr>
+        <w:t>، ما يجعل متابعة هذه الفئات مفيدة عند ترتيب أولويات مراجعة التوقعات</w:t>
       </w:r>
       <w:r>
         <w:rPr>
@@ -1792,10 +1191,10 @@
           <w:szCs w:val="24"/>
         </w:rPr>
         <w:drawing>
-          <wp:inline distT="0" distB="0" distL="0" distR="0" wp14:anchorId="571E193D" wp14:editId="360DF3E6">
+          <wp:inline distT="0" distB="0" distL="0" distR="0" wp14:anchorId="2836D492" wp14:editId="7EF020BD">
             <wp:extent cx="4975860" cy="2484120"/>
             <wp:effectExtent l="0" t="0" r="0" b="0"/>
-            <wp:docPr id="1058235046" name="Picture 2" descr="الشكل 4: الطلبات الوسيطة مع الترويج ومن دونه. يعرض مقارنة وصفية داخل أزواج المركز والوجبة. لا تثبت الفروق أن الترويج هو سبب زيادة الطلب."/>
+            <wp:docPr id="678094022" name="Picture 4" descr="الشكل 2: أكثر فئات الوجبات طلبًا. تقارن الأعمدة إجمالي الطلبات في أكبر فئات الوجبات، وتظهر تصدّر المشروبات ضمن الفئات المعروضة."/>
             <wp:cNvGraphicFramePr>
               <a:graphicFrameLocks xmlns:a="http://schemas.openxmlformats.org/drawingml/2006/main" noChangeAspect="1"/>
             </wp:cNvGraphicFramePr>
@@ -1803,7 +1202,7 @@
               <a:graphicData uri="http://schemas.openxmlformats.org/drawingml/2006/picture">
                 <pic:pic xmlns:pic="http://schemas.openxmlformats.org/drawingml/2006/picture">
                   <pic:nvPicPr>
-                    <pic:cNvPr id="0" name="الشكل 4" descr="الشكل 4: الطلبات الوسيطة مع الترويج ومن دونه. يعرض مقارنة وصفية داخل أزواج المركز والوجبة. لا تثبت الفروق أن الترويج هو سبب زيادة الطلب."/>
+                    <pic:cNvPr id="0" name="الشكل 2" descr="الشكل 2: أكثر فئات الوجبات طلبًا. تقارن الأعمدة إجمالي الطلبات في أكبر فئات الوجبات، وتظهر تصدّر المشروبات ضمن الفئات المعروضة."/>
                     <pic:cNvPicPr>
                       <a:picLocks noChangeAspect="1" noChangeArrowheads="1"/>
                     </pic:cNvPicPr>
@@ -1868,7 +1267,7 @@
           <w:bCs/>
           <w:color w:val="1F3A5F"/>
         </w:rPr>
-        <w:t xml:space="preserve">4: </w:t>
+        <w:t xml:space="preserve">2: </w:t>
       </w:r>
       <w:r>
         <w:rPr>
@@ -1878,7 +1277,7 @@
           <w:color w:val="1F3A5F"/>
           <w:rtl/>
         </w:rPr>
-        <w:t>الطلبات الوسيطة مع الترويج ومن دونه</w:t>
+        <w:t>أكثر فئات الوجبات طلبًا</w:t>
       </w:r>
       <w:r>
         <w:rPr>
@@ -1895,22 +1294,7 @@
           <w:color w:val="595959"/>
           <w:rtl/>
         </w:rPr>
-        <w:t xml:space="preserve"> يعرض مقارنة وصفية داخل أزواج المركز والوجبة</w:t>
-      </w:r>
-      <w:r>
-        <w:rPr>
-          <w:rFonts w:ascii="Arial" w:eastAsia="Times New Roman" w:hAnsi="Arial" w:cs="Arial"/>
-          <w:color w:val="595959"/>
-        </w:rPr>
-        <w:t xml:space="preserve">. </w:t>
-      </w:r>
-      <w:r>
-        <w:rPr>
-          <w:rFonts w:ascii="Arial" w:eastAsia="Times New Roman" w:hAnsi="Arial" w:cs="Arial"/>
-          <w:color w:val="595959"/>
-          <w:rtl/>
-        </w:rPr>
-        <w:t>لا تثبت الفروق أن الترويج هو سبب زيادة الطلب</w:t>
+        <w:t xml:space="preserve"> تقارن الأعمدة إجمالي الطلبات في أكبر فئات الوجبات، وتظهر تصدّر المشروبات ضمن الفئات المعروضة</w:t>
       </w:r>
       <w:r>
         <w:rPr>
@@ -1945,7 +1329,7 @@
           <w:sz w:val="30"/>
           <w:szCs w:val="30"/>
         </w:rPr>
-        <w:t xml:space="preserve">5. </w:t>
+        <w:t xml:space="preserve">3. </w:t>
       </w:r>
       <w:r>
         <w:rPr>
@@ -1957,7 +1341,7 @@
           <w:szCs w:val="30"/>
           <w:rtl/>
         </w:rPr>
-        <w:t>الخصم والطلبات</w:t>
+        <w:t>اختلافات وصفية بين أنواع المراكز</w:t>
       </w:r>
     </w:p>
     <w:p>
@@ -1979,45 +1363,26 @@
           <w:szCs w:val="24"/>
           <w:rtl/>
         </w:rPr>
-        <w:t xml:space="preserve">بلغ ارتباط الرتب بين نسبة الخصم وعدد الطلبات </w:t>
-      </w:r>
-      <w:r>
-        <w:rPr>
-          <w:rFonts w:ascii="Arial" w:eastAsia="Times New Roman" w:hAnsi="Arial" w:cs="Arial"/>
-          <w:color w:val="262626"/>
-          <w:sz w:val="24"/>
-          <w:szCs w:val="24"/>
-        </w:rPr>
-        <w:t xml:space="preserve">0.122 </w:t>
-      </w:r>
-      <w:r>
-        <w:rPr>
-          <w:rFonts w:ascii="Arial" w:eastAsia="Times New Roman" w:hAnsi="Arial" w:cs="Arial"/>
-          <w:color w:val="262626"/>
-          <w:sz w:val="24"/>
-          <w:szCs w:val="24"/>
-          <w:rtl/>
-        </w:rPr>
-        <w:t xml:space="preserve">عبر </w:t>
-      </w:r>
-      <w:r>
-        <w:rPr>
-          <w:rFonts w:ascii="Arial" w:eastAsia="Times New Roman" w:hAnsi="Arial" w:cs="Arial"/>
-          <w:color w:val="262626"/>
-          <w:sz w:val="24"/>
-          <w:szCs w:val="24"/>
-        </w:rPr>
-        <w:t xml:space="preserve">456,548 </w:t>
-      </w:r>
-      <w:r>
-        <w:rPr>
-          <w:rFonts w:ascii="Arial" w:eastAsia="Times New Roman" w:hAnsi="Arial" w:cs="Arial"/>
-          <w:color w:val="262626"/>
-          <w:sz w:val="24"/>
-          <w:szCs w:val="24"/>
-          <w:rtl/>
-        </w:rPr>
-        <w:t>مشاهدة؛ وهو ارتباط موجب ضعيف</w:t>
+        <w:t xml:space="preserve">يعرض الرسم متوسط إجمالي الطلب لكل مركز بحسب نوعه، ويظهر </w:t>
+      </w:r>
+      <w:r>
+        <w:rPr>
+          <w:rFonts w:ascii="Arial" w:eastAsia="Times New Roman" w:hAnsi="Arial" w:cs="Arial"/>
+          <w:color w:val="262626"/>
+          <w:sz w:val="24"/>
+          <w:szCs w:val="24"/>
+        </w:rPr>
+        <w:t xml:space="preserve">TYPE_B </w:t>
+      </w:r>
+      <w:r>
+        <w:rPr>
+          <w:rFonts w:ascii="Arial" w:eastAsia="Times New Roman" w:hAnsi="Arial" w:cs="Arial"/>
+          <w:color w:val="262626"/>
+          <w:sz w:val="24"/>
+          <w:szCs w:val="24"/>
+          <w:rtl/>
+        </w:rPr>
+        <w:t>أعلى متوسط بين الأنواع المعروضة</w:t>
       </w:r>
       <w:r>
         <w:rPr>
@@ -2036,7 +1401,7 @@
           <w:szCs w:val="24"/>
           <w:rtl/>
         </w:rPr>
-        <w:t>لا يعني ذلك أن زيادة الخصم ستؤدي حتمًا إلى زيادة الطلب، لأن اختلاف الوجبات والمراكز والأسابيع قد يرتبط بالقيم المرصودة</w:t>
+        <w:t>هذا وصف للمراكز في البيانات المتاحة ولا يحدد سبب الفروق أو يثبت أن نوع المركز هو العامل المؤثر</w:t>
       </w:r>
       <w:r>
         <w:rPr>
@@ -2069,7 +1434,642 @@
           <w:szCs w:val="24"/>
         </w:rPr>
         <w:drawing>
-          <wp:inline distT="0" distB="0" distL="0" distR="0" wp14:anchorId="38BB18D8" wp14:editId="453FA79C">
+          <wp:inline distT="0" distB="0" distL="0" distR="0" wp14:anchorId="5A85B92F" wp14:editId="653009AD">
+            <wp:extent cx="4975860" cy="2484120"/>
+            <wp:effectExtent l="0" t="0" r="0" b="0"/>
+            <wp:docPr id="1034073665" name="Picture 3" descr="الشكل 3: متوسط إجمالي الطلب حسب نوع المركز. يعرض الرسم متوسط الطلب التراكمي لكل مركز حسب نوعه؛ وهو وصف للبيانات وليس تفسيرًا لسبب الاختلاف."/>
+            <wp:cNvGraphicFramePr>
+              <a:graphicFrameLocks xmlns:a="http://schemas.openxmlformats.org/drawingml/2006/main" noChangeAspect="1"/>
+            </wp:cNvGraphicFramePr>
+            <a:graphic xmlns:a="http://schemas.openxmlformats.org/drawingml/2006/main">
+              <a:graphicData uri="http://schemas.openxmlformats.org/drawingml/2006/picture">
+                <pic:pic xmlns:pic="http://schemas.openxmlformats.org/drawingml/2006/picture">
+                  <pic:nvPicPr>
+                    <pic:cNvPr id="0" name="الشكل 3" descr="الشكل 3: متوسط إجمالي الطلب حسب نوع المركز. يعرض الرسم متوسط الطلب التراكمي لكل مركز حسب نوعه؛ وهو وصف للبيانات وليس تفسيرًا لسبب الاختلاف."/>
+                    <pic:cNvPicPr>
+                      <a:picLocks noChangeAspect="1" noChangeArrowheads="1"/>
+                    </pic:cNvPicPr>
+                  </pic:nvPicPr>
+                  <pic:blipFill>
+                    <a:blip r:embed="rId9" cstate="print">
+                      <a:extLst>
+                        <a:ext uri="{28A0092B-C50C-407E-A947-70E740481C1C}">
+                          <a14:useLocalDpi xmlns:a14="http://schemas.microsoft.com/office/drawing/2010/main" val="0"/>
+                        </a:ext>
+                      </a:extLst>
+                    </a:blip>
+                    <a:srcRect/>
+                    <a:stretch>
+                      <a:fillRect/>
+                    </a:stretch>
+                  </pic:blipFill>
+                  <pic:spPr bwMode="auto">
+                    <a:xfrm>
+                      <a:off x="0" y="0"/>
+                      <a:ext cx="4975860" cy="2484120"/>
+                    </a:xfrm>
+                    <a:prstGeom prst="rect">
+                      <a:avLst/>
+                    </a:prstGeom>
+                    <a:noFill/>
+                    <a:ln>
+                      <a:noFill/>
+                    </a:ln>
+                  </pic:spPr>
+                </pic:pic>
+              </a:graphicData>
+            </a:graphic>
+          </wp:inline>
+        </w:drawing>
+      </w:r>
+    </w:p>
+    <w:p>
+      <w:pPr>
+        <w:keepLines/>
+        <w:bidi/>
+        <w:spacing w:before="60" w:after="300" w:line="300" w:lineRule="auto"/>
+        <w:rPr>
+          <w:rFonts w:ascii="Arial" w:eastAsia="Times New Roman" w:hAnsi="Arial" w:cs="Arial"/>
+          <w:color w:val="595959"/>
+        </w:rPr>
+      </w:pPr>
+      <w:r>
+        <w:rPr>
+          <w:rFonts w:ascii="Arial" w:eastAsia="Times New Roman" w:hAnsi="Arial" w:cs="Arial"/>
+          <w:b/>
+          <w:bCs/>
+          <w:color w:val="1F3A5F"/>
+          <w:rtl/>
+        </w:rPr>
+        <w:t xml:space="preserve">الشكل </w:t>
+      </w:r>
+      <w:r>
+        <w:rPr>
+          <w:rFonts w:ascii="Arial" w:eastAsia="Times New Roman" w:hAnsi="Arial" w:cs="Arial"/>
+          <w:b/>
+          <w:bCs/>
+          <w:color w:val="1F3A5F"/>
+        </w:rPr>
+        <w:t xml:space="preserve">3: </w:t>
+      </w:r>
+      <w:r>
+        <w:rPr>
+          <w:rFonts w:ascii="Arial" w:eastAsia="Times New Roman" w:hAnsi="Arial" w:cs="Arial"/>
+          <w:b/>
+          <w:bCs/>
+          <w:color w:val="1F3A5F"/>
+          <w:rtl/>
+        </w:rPr>
+        <w:t>متوسط إجمالي الطلب حسب نوع المركز</w:t>
+      </w:r>
+      <w:r>
+        <w:rPr>
+          <w:rFonts w:ascii="Arial" w:eastAsia="Times New Roman" w:hAnsi="Arial" w:cs="Arial"/>
+          <w:b/>
+          <w:bCs/>
+          <w:color w:val="1F3A5F"/>
+        </w:rPr>
+        <w:t>.</w:t>
+      </w:r>
+      <w:r>
+        <w:rPr>
+          <w:rFonts w:ascii="Arial" w:eastAsia="Times New Roman" w:hAnsi="Arial" w:cs="Arial"/>
+          <w:color w:val="595959"/>
+          <w:rtl/>
+        </w:rPr>
+        <w:t xml:space="preserve"> يعرض الرسم متوسط الطلب التراكمي لكل مركز حسب نوعه؛ وهو وصف للبيانات وليس تفسيرًا لسبب الاختلاف</w:t>
+      </w:r>
+      <w:r>
+        <w:rPr>
+          <w:rFonts w:ascii="Arial" w:eastAsia="Times New Roman" w:hAnsi="Arial" w:cs="Arial"/>
+          <w:color w:val="595959"/>
+        </w:rPr>
+        <w:t>.</w:t>
+      </w:r>
+    </w:p>
+    <w:p>
+      <w:pPr>
+        <w:keepNext/>
+        <w:keepLines/>
+        <w:bidi/>
+        <w:spacing w:before="320" w:after="100" w:line="320" w:lineRule="auto"/>
+        <w:outlineLvl w:val="1"/>
+        <w:rPr>
+          <w:rFonts w:ascii="Arial" w:eastAsia="Times New Roman" w:hAnsi="Arial" w:cs="Arial"/>
+          <w:b/>
+          <w:bCs/>
+          <w:color w:val="2E75B6"/>
+          <w:sz w:val="30"/>
+          <w:szCs w:val="30"/>
+        </w:rPr>
+      </w:pPr>
+      <w:r>
+        <w:rPr>
+          <w:rFonts w:ascii="Arial" w:eastAsia="Times New Roman" w:hAnsi="Arial" w:cs="Arial"/>
+          <w:b/>
+          <w:bCs/>
+          <w:color w:val="2E75B6"/>
+          <w:sz w:val="30"/>
+          <w:szCs w:val="30"/>
+        </w:rPr>
+        <w:lastRenderedPageBreak/>
+        <w:t xml:space="preserve">4. </w:t>
+      </w:r>
+      <w:r>
+        <w:rPr>
+          <w:rFonts w:ascii="Arial" w:eastAsia="Times New Roman" w:hAnsi="Arial" w:cs="Arial"/>
+          <w:b/>
+          <w:bCs/>
+          <w:color w:val="2E75B6"/>
+          <w:sz w:val="30"/>
+          <w:szCs w:val="30"/>
+          <w:rtl/>
+        </w:rPr>
+        <w:t>الترويج والطلبات</w:t>
+      </w:r>
+    </w:p>
+    <w:p>
+      <w:pPr>
+        <w:bidi/>
+        <w:spacing w:after="120" w:line="336" w:lineRule="auto"/>
+        <w:rPr>
+          <w:rFonts w:ascii="Arial" w:eastAsia="Times New Roman" w:hAnsi="Arial" w:cs="Arial"/>
+          <w:color w:val="262626"/>
+          <w:sz w:val="24"/>
+          <w:szCs w:val="24"/>
+        </w:rPr>
+      </w:pPr>
+      <w:r>
+        <w:rPr>
+          <w:rFonts w:ascii="Arial" w:eastAsia="Times New Roman" w:hAnsi="Arial" w:cs="Arial"/>
+          <w:color w:val="262626"/>
+          <w:sz w:val="24"/>
+          <w:szCs w:val="24"/>
+          <w:rtl/>
+        </w:rPr>
+        <w:t xml:space="preserve">في المقارنات المطابقة للمركز والوجبة، كان وسيط الطلبات مع الترويج بالبريد </w:t>
+      </w:r>
+      <w:r>
+        <w:rPr>
+          <w:rFonts w:ascii="Arial" w:eastAsia="Times New Roman" w:hAnsi="Arial" w:cs="Arial"/>
+          <w:color w:val="262626"/>
+          <w:sz w:val="24"/>
+          <w:szCs w:val="24"/>
+        </w:rPr>
+        <w:t xml:space="preserve">325 </w:t>
+      </w:r>
+      <w:r>
+        <w:rPr>
+          <w:rFonts w:ascii="Arial" w:eastAsia="Times New Roman" w:hAnsi="Arial" w:cs="Arial"/>
+          <w:color w:val="262626"/>
+          <w:sz w:val="24"/>
+          <w:szCs w:val="24"/>
+          <w:rtl/>
+        </w:rPr>
+        <w:t xml:space="preserve">مقابل </w:t>
+      </w:r>
+      <w:r>
+        <w:rPr>
+          <w:rFonts w:ascii="Arial" w:eastAsia="Times New Roman" w:hAnsi="Arial" w:cs="Arial"/>
+          <w:color w:val="262626"/>
+          <w:sz w:val="24"/>
+          <w:szCs w:val="24"/>
+        </w:rPr>
+        <w:t xml:space="preserve">134 </w:t>
+      </w:r>
+      <w:r>
+        <w:rPr>
+          <w:rFonts w:ascii="Arial" w:eastAsia="Times New Roman" w:hAnsi="Arial" w:cs="Arial"/>
+          <w:color w:val="262626"/>
+          <w:sz w:val="24"/>
+          <w:szCs w:val="24"/>
+          <w:rtl/>
+        </w:rPr>
+        <w:t xml:space="preserve">من دونه، ومع الظهور في الصفحة الرئيسية </w:t>
+      </w:r>
+      <w:r>
+        <w:rPr>
+          <w:rFonts w:ascii="Arial" w:eastAsia="Times New Roman" w:hAnsi="Arial" w:cs="Arial"/>
+          <w:color w:val="262626"/>
+          <w:sz w:val="24"/>
+          <w:szCs w:val="24"/>
+        </w:rPr>
+        <w:t xml:space="preserve">311 </w:t>
+      </w:r>
+      <w:r>
+        <w:rPr>
+          <w:rFonts w:ascii="Arial" w:eastAsia="Times New Roman" w:hAnsi="Arial" w:cs="Arial"/>
+          <w:color w:val="262626"/>
+          <w:sz w:val="24"/>
+          <w:szCs w:val="24"/>
+          <w:rtl/>
+        </w:rPr>
+        <w:t xml:space="preserve">مقابل </w:t>
+      </w:r>
+      <w:r>
+        <w:rPr>
+          <w:rFonts w:ascii="Arial" w:eastAsia="Times New Roman" w:hAnsi="Arial" w:cs="Arial"/>
+          <w:color w:val="262626"/>
+          <w:sz w:val="24"/>
+          <w:szCs w:val="24"/>
+        </w:rPr>
+        <w:t xml:space="preserve">123 </w:t>
+      </w:r>
+      <w:r>
+        <w:rPr>
+          <w:rFonts w:ascii="Arial" w:eastAsia="Times New Roman" w:hAnsi="Arial" w:cs="Arial"/>
+          <w:color w:val="262626"/>
+          <w:sz w:val="24"/>
+          <w:szCs w:val="24"/>
+          <w:rtl/>
+        </w:rPr>
+        <w:t>من دونه</w:t>
+      </w:r>
+      <w:r>
+        <w:rPr>
+          <w:rFonts w:ascii="Arial" w:eastAsia="Times New Roman" w:hAnsi="Arial" w:cs="Arial"/>
+          <w:color w:val="262626"/>
+          <w:sz w:val="24"/>
+          <w:szCs w:val="24"/>
+        </w:rPr>
+        <w:t xml:space="preserve">. </w:t>
+      </w:r>
+      <w:r>
+        <w:rPr>
+          <w:rFonts w:ascii="Arial" w:eastAsia="Times New Roman" w:hAnsi="Arial" w:cs="Arial"/>
+          <w:color w:val="262626"/>
+          <w:sz w:val="24"/>
+          <w:szCs w:val="24"/>
+          <w:rtl/>
+        </w:rPr>
+        <w:t xml:space="preserve">شملت المقارنة </w:t>
+      </w:r>
+      <w:r>
+        <w:rPr>
+          <w:rFonts w:ascii="Arial" w:eastAsia="Times New Roman" w:hAnsi="Arial" w:cs="Arial"/>
+          <w:color w:val="262626"/>
+          <w:sz w:val="24"/>
+          <w:szCs w:val="24"/>
+        </w:rPr>
+        <w:t xml:space="preserve">2830 </w:t>
+      </w:r>
+      <w:r>
+        <w:rPr>
+          <w:rFonts w:ascii="Arial" w:eastAsia="Times New Roman" w:hAnsi="Arial" w:cs="Arial"/>
+          <w:color w:val="262626"/>
+          <w:sz w:val="24"/>
+          <w:szCs w:val="24"/>
+          <w:rtl/>
+        </w:rPr>
+        <w:t>زوجًا للبريد و</w:t>
+      </w:r>
+      <w:r>
+        <w:rPr>
+          <w:rFonts w:ascii="Arial" w:eastAsia="Times New Roman" w:hAnsi="Arial" w:cs="Arial"/>
+          <w:color w:val="262626"/>
+          <w:sz w:val="24"/>
+          <w:szCs w:val="24"/>
+        </w:rPr>
+        <w:t xml:space="preserve">2928 </w:t>
+      </w:r>
+      <w:r>
+        <w:rPr>
+          <w:rFonts w:ascii="Arial" w:eastAsia="Times New Roman" w:hAnsi="Arial" w:cs="Arial"/>
+          <w:color w:val="262626"/>
+          <w:sz w:val="24"/>
+          <w:szCs w:val="24"/>
+          <w:rtl/>
+        </w:rPr>
+        <w:t>زوجًا للصفحة الرئيسية</w:t>
+      </w:r>
+      <w:r>
+        <w:rPr>
+          <w:rFonts w:ascii="Arial" w:eastAsia="Times New Roman" w:hAnsi="Arial" w:cs="Arial"/>
+          <w:color w:val="262626"/>
+          <w:sz w:val="24"/>
+          <w:szCs w:val="24"/>
+        </w:rPr>
+        <w:t xml:space="preserve">. </w:t>
+      </w:r>
+      <w:r>
+        <w:rPr>
+          <w:rFonts w:ascii="Arial" w:eastAsia="Times New Roman" w:hAnsi="Arial" w:cs="Arial"/>
+          <w:color w:val="262626"/>
+          <w:sz w:val="24"/>
+          <w:szCs w:val="24"/>
+          <w:rtl/>
+        </w:rPr>
+        <w:t>هذه ارتباطات وصفية؛ تكرار الأسابيع وعوامل أخرى محتملة يحدان من تفسيرها، ولا تثبت أن الترويج تسبب في الزيادة</w:t>
+      </w:r>
+      <w:r>
+        <w:rPr>
+          <w:rFonts w:ascii="Arial" w:eastAsia="Times New Roman" w:hAnsi="Arial" w:cs="Arial"/>
+          <w:color w:val="262626"/>
+          <w:sz w:val="24"/>
+          <w:szCs w:val="24"/>
+        </w:rPr>
+        <w:t>.</w:t>
+      </w:r>
+    </w:p>
+    <w:p>
+      <w:pPr>
+        <w:keepNext/>
+        <w:bidi/>
+        <w:spacing w:before="160" w:after="0" w:line="240" w:lineRule="auto"/>
+        <w:rPr>
+          <w:rFonts w:ascii="Arial" w:eastAsia="Times New Roman" w:hAnsi="Arial" w:cs="Arial"/>
+          <w:color w:val="262626"/>
+          <w:sz w:val="24"/>
+          <w:szCs w:val="24"/>
+        </w:rPr>
+      </w:pPr>
+      <w:r>
+        <w:rPr>
+          <w:rFonts w:ascii="Arial" w:eastAsia="Times New Roman" w:hAnsi="Arial" w:cs="Arial"/>
+          <w:noProof/>
+          <w:color w:val="262626"/>
+          <w:sz w:val="24"/>
+          <w:szCs w:val="24"/>
+        </w:rPr>
+        <w:drawing>
+          <wp:inline distT="0" distB="0" distL="0" distR="0" wp14:anchorId="571E193D" wp14:editId="52F391DF">
+            <wp:extent cx="4975860" cy="2484120"/>
+            <wp:effectExtent l="0" t="0" r="0" b="0"/>
+            <wp:docPr id="1058235046" name="Picture 2" descr="الشكل 4: الطلبات الوسيطة مع الترويج ومن دونه. يعرض مقارنة وصفية داخل أزواج المركز والوجبة. لا تثبت الفروق أن الترويج هو سبب زيادة الطلب."/>
+            <wp:cNvGraphicFramePr>
+              <a:graphicFrameLocks xmlns:a="http://schemas.openxmlformats.org/drawingml/2006/main" noChangeAspect="1"/>
+            </wp:cNvGraphicFramePr>
+            <a:graphic xmlns:a="http://schemas.openxmlformats.org/drawingml/2006/main">
+              <a:graphicData uri="http://schemas.openxmlformats.org/drawingml/2006/picture">
+                <pic:pic xmlns:pic="http://schemas.openxmlformats.org/drawingml/2006/picture">
+                  <pic:nvPicPr>
+                    <pic:cNvPr id="0" name="الشكل 4" descr="الشكل 4: الطلبات الوسيطة مع الترويج ومن دونه. يعرض مقارنة وصفية داخل أزواج المركز والوجبة. لا تثبت الفروق أن الترويج هو سبب زيادة الطلب."/>
+                    <pic:cNvPicPr>
+                      <a:picLocks noChangeAspect="1" noChangeArrowheads="1"/>
+                    </pic:cNvPicPr>
+                  </pic:nvPicPr>
+                  <pic:blipFill>
+                    <a:blip r:embed="rId10" cstate="print">
+                      <a:extLst>
+                        <a:ext uri="{28A0092B-C50C-407E-A947-70E740481C1C}">
+                          <a14:useLocalDpi xmlns:a14="http://schemas.microsoft.com/office/drawing/2010/main" val="0"/>
+                        </a:ext>
+                      </a:extLst>
+                    </a:blip>
+                    <a:srcRect/>
+                    <a:stretch>
+                      <a:fillRect/>
+                    </a:stretch>
+                  </pic:blipFill>
+                  <pic:spPr bwMode="auto">
+                    <a:xfrm>
+                      <a:off x="0" y="0"/>
+                      <a:ext cx="4975860" cy="2484120"/>
+                    </a:xfrm>
+                    <a:prstGeom prst="rect">
+                      <a:avLst/>
+                    </a:prstGeom>
+                    <a:noFill/>
+                    <a:ln>
+                      <a:noFill/>
+                    </a:ln>
+                  </pic:spPr>
+                </pic:pic>
+              </a:graphicData>
+            </a:graphic>
+          </wp:inline>
+        </w:drawing>
+      </w:r>
+    </w:p>
+    <w:p>
+      <w:pPr>
+        <w:keepLines/>
+        <w:bidi/>
+        <w:spacing w:before="60" w:after="300" w:line="300" w:lineRule="auto"/>
+        <w:rPr>
+          <w:rFonts w:ascii="Arial" w:eastAsia="Times New Roman" w:hAnsi="Arial" w:cs="Arial"/>
+          <w:color w:val="595959"/>
+        </w:rPr>
+      </w:pPr>
+      <w:r>
+        <w:rPr>
+          <w:rFonts w:ascii="Arial" w:eastAsia="Times New Roman" w:hAnsi="Arial" w:cs="Arial"/>
+          <w:b/>
+          <w:bCs/>
+          <w:color w:val="1F3A5F"/>
+          <w:rtl/>
+        </w:rPr>
+        <w:t xml:space="preserve">الشكل </w:t>
+      </w:r>
+      <w:r>
+        <w:rPr>
+          <w:rFonts w:ascii="Arial" w:eastAsia="Times New Roman" w:hAnsi="Arial" w:cs="Arial"/>
+          <w:b/>
+          <w:bCs/>
+          <w:color w:val="1F3A5F"/>
+        </w:rPr>
+        <w:t xml:space="preserve">4: </w:t>
+      </w:r>
+      <w:r>
+        <w:rPr>
+          <w:rFonts w:ascii="Arial" w:eastAsia="Times New Roman" w:hAnsi="Arial" w:cs="Arial"/>
+          <w:b/>
+          <w:bCs/>
+          <w:color w:val="1F3A5F"/>
+          <w:rtl/>
+        </w:rPr>
+        <w:t>الطلبات الوسيطة مع الترويج ومن دونه</w:t>
+      </w:r>
+      <w:r>
+        <w:rPr>
+          <w:rFonts w:ascii="Arial" w:eastAsia="Times New Roman" w:hAnsi="Arial" w:cs="Arial"/>
+          <w:b/>
+          <w:bCs/>
+          <w:color w:val="1F3A5F"/>
+        </w:rPr>
+        <w:t>.</w:t>
+      </w:r>
+      <w:r>
+        <w:rPr>
+          <w:rFonts w:ascii="Arial" w:eastAsia="Times New Roman" w:hAnsi="Arial" w:cs="Arial"/>
+          <w:color w:val="595959"/>
+          <w:rtl/>
+        </w:rPr>
+        <w:t xml:space="preserve"> يعرض مقارنة وصفية داخل أزواج المركز والوجبة</w:t>
+      </w:r>
+      <w:r>
+        <w:rPr>
+          <w:rFonts w:ascii="Arial" w:eastAsia="Times New Roman" w:hAnsi="Arial" w:cs="Arial"/>
+          <w:color w:val="595959"/>
+        </w:rPr>
+        <w:t xml:space="preserve">. </w:t>
+      </w:r>
+      <w:r>
+        <w:rPr>
+          <w:rFonts w:ascii="Arial" w:eastAsia="Times New Roman" w:hAnsi="Arial" w:cs="Arial"/>
+          <w:color w:val="595959"/>
+          <w:rtl/>
+        </w:rPr>
+        <w:t>لا تثبت الفروق أن الترويج هو سبب زيادة الطلب</w:t>
+      </w:r>
+      <w:r>
+        <w:rPr>
+          <w:rFonts w:ascii="Arial" w:eastAsia="Times New Roman" w:hAnsi="Arial" w:cs="Arial"/>
+          <w:color w:val="595959"/>
+        </w:rPr>
+        <w:t>.</w:t>
+      </w:r>
+    </w:p>
+    <w:p>
+      <w:pPr>
+        <w:keepNext/>
+        <w:keepLines/>
+        <w:bidi/>
+        <w:spacing w:before="320" w:after="100" w:line="320" w:lineRule="auto"/>
+        <w:outlineLvl w:val="1"/>
+        <w:rPr>
+          <w:rFonts w:ascii="Arial" w:eastAsia="Times New Roman" w:hAnsi="Arial" w:cs="Arial"/>
+          <w:b/>
+          <w:bCs/>
+          <w:color w:val="2E75B6"/>
+          <w:sz w:val="30"/>
+          <w:szCs w:val="30"/>
+        </w:rPr>
+      </w:pPr>
+      <w:r>
+        <w:rPr>
+          <w:rFonts w:ascii="Arial" w:eastAsia="Times New Roman" w:hAnsi="Arial" w:cs="Arial"/>
+          <w:b/>
+          <w:bCs/>
+          <w:color w:val="2E75B6"/>
+          <w:sz w:val="30"/>
+          <w:szCs w:val="30"/>
+        </w:rPr>
+        <w:t xml:space="preserve">5. </w:t>
+      </w:r>
+      <w:r>
+        <w:rPr>
+          <w:rFonts w:ascii="Arial" w:eastAsia="Times New Roman" w:hAnsi="Arial" w:cs="Arial"/>
+          <w:b/>
+          <w:bCs/>
+          <w:color w:val="2E75B6"/>
+          <w:sz w:val="30"/>
+          <w:szCs w:val="30"/>
+          <w:rtl/>
+        </w:rPr>
+        <w:t>الخصم والطلبات</w:t>
+      </w:r>
+    </w:p>
+    <w:p>
+      <w:pPr>
+        <w:bidi/>
+        <w:spacing w:after="120" w:line="336" w:lineRule="auto"/>
+        <w:rPr>
+          <w:rFonts w:ascii="Arial" w:eastAsia="Times New Roman" w:hAnsi="Arial" w:cs="Arial"/>
+          <w:color w:val="262626"/>
+          <w:sz w:val="24"/>
+          <w:szCs w:val="24"/>
+        </w:rPr>
+      </w:pPr>
+      <w:r>
+        <w:rPr>
+          <w:rFonts w:ascii="Arial" w:eastAsia="Times New Roman" w:hAnsi="Arial" w:cs="Arial"/>
+          <w:color w:val="262626"/>
+          <w:sz w:val="24"/>
+          <w:szCs w:val="24"/>
+          <w:rtl/>
+        </w:rPr>
+        <w:t xml:space="preserve">بلغ ارتباط الرتب بين نسبة الخصم وعدد الطلبات </w:t>
+      </w:r>
+      <w:r>
+        <w:rPr>
+          <w:rFonts w:ascii="Arial" w:eastAsia="Times New Roman" w:hAnsi="Arial" w:cs="Arial"/>
+          <w:color w:val="262626"/>
+          <w:sz w:val="24"/>
+          <w:szCs w:val="24"/>
+        </w:rPr>
+        <w:t xml:space="preserve">0.122 </w:t>
+      </w:r>
+      <w:r>
+        <w:rPr>
+          <w:rFonts w:ascii="Arial" w:eastAsia="Times New Roman" w:hAnsi="Arial" w:cs="Arial"/>
+          <w:color w:val="262626"/>
+          <w:sz w:val="24"/>
+          <w:szCs w:val="24"/>
+          <w:rtl/>
+        </w:rPr>
+        <w:t xml:space="preserve">عبر </w:t>
+      </w:r>
+      <w:r>
+        <w:rPr>
+          <w:rFonts w:ascii="Arial" w:eastAsia="Times New Roman" w:hAnsi="Arial" w:cs="Arial"/>
+          <w:color w:val="262626"/>
+          <w:sz w:val="24"/>
+          <w:szCs w:val="24"/>
+        </w:rPr>
+        <w:t xml:space="preserve">456,548 </w:t>
+      </w:r>
+      <w:r>
+        <w:rPr>
+          <w:rFonts w:ascii="Arial" w:eastAsia="Times New Roman" w:hAnsi="Arial" w:cs="Arial"/>
+          <w:color w:val="262626"/>
+          <w:sz w:val="24"/>
+          <w:szCs w:val="24"/>
+          <w:rtl/>
+        </w:rPr>
+        <w:t>مشاهدة؛ وهو ارتباط موجب ضعيف</w:t>
+      </w:r>
+      <w:r>
+        <w:rPr>
+          <w:rFonts w:ascii="Arial" w:eastAsia="Times New Roman" w:hAnsi="Arial" w:cs="Arial"/>
+          <w:color w:val="262626"/>
+          <w:sz w:val="24"/>
+          <w:szCs w:val="24"/>
+        </w:rPr>
+        <w:t xml:space="preserve">. </w:t>
+      </w:r>
+      <w:r>
+        <w:rPr>
+          <w:rFonts w:ascii="Arial" w:eastAsia="Times New Roman" w:hAnsi="Arial" w:cs="Arial"/>
+          <w:color w:val="262626"/>
+          <w:sz w:val="24"/>
+          <w:szCs w:val="24"/>
+          <w:rtl/>
+        </w:rPr>
+        <w:t>لا يعني ذلك أن زيادة الخصم ستؤدي حتمًا إلى زيادة الطلب، لأن اختلاف الوجبات والمراكز والأسابيع قد يرتبط بالقيم المرصودة</w:t>
+      </w:r>
+      <w:r>
+        <w:rPr>
+          <w:rFonts w:ascii="Arial" w:eastAsia="Times New Roman" w:hAnsi="Arial" w:cs="Arial"/>
+          <w:color w:val="262626"/>
+          <w:sz w:val="24"/>
+          <w:szCs w:val="24"/>
+        </w:rPr>
+        <w:t>.</w:t>
+      </w:r>
+    </w:p>
+    <w:p>
+      <w:pPr>
+        <w:keepNext/>
+        <w:bidi/>
+        <w:spacing w:before="160" w:after="0" w:line="240" w:lineRule="auto"/>
+        <w:rPr>
+          <w:rFonts w:ascii="Arial" w:eastAsia="Times New Roman" w:hAnsi="Arial" w:cs="Arial"/>
+          <w:color w:val="262626"/>
+          <w:sz w:val="24"/>
+          <w:szCs w:val="24"/>
+        </w:rPr>
+      </w:pPr>
+      <w:r>
+        <w:rPr>
+          <w:rFonts w:ascii="Arial" w:eastAsia="Times New Roman" w:hAnsi="Arial" w:cs="Arial"/>
+          <w:noProof/>
+          <w:color w:val="262626"/>
+          <w:sz w:val="24"/>
+          <w:szCs w:val="24"/>
+        </w:rPr>
+        <w:drawing>
+          <wp:inline distT="0" distB="0" distL="0" distR="0" wp14:anchorId="38BB18D8" wp14:editId="2AA9E644">
             <wp:extent cx="4975860" cy="2484120"/>
             <wp:effectExtent l="0" t="0" r="0" b="0"/>
             <wp:docPr id="475377253" name="Picture 1" descr="الشكل 5: العلاقة بين نسبة الخصم والطلبات. يعرض متوسط الطلب عبر شرائح الخصم ومعامل ارتباط الرتب. الارتباط لا يثبت السببية."/>
@@ -2086,7 +2086,7 @@
                     </pic:cNvPicPr>
                   </pic:nvPicPr>
                   <pic:blipFill>
-                    <a:blip r:embed="rId9" cstate="print">
+                    <a:blip r:embed="rId11" cstate="print">
                       <a:extLst>
                         <a:ext uri="{28A0092B-C50C-407E-A947-70E740481C1C}">
                           <a14:useLocalDpi xmlns:a14="http://schemas.microsoft.com/office/drawing/2010/main" val="0"/>
@@ -3780,8 +3780,8 @@
       </w:pPr>
     </w:p>
     <w:sectPr>
-      <w:headerReference w:type="default" r:id="rId10"/>
-      <w:footerReference w:type="default" r:id="rId11"/>
+      <w:headerReference w:type="default" r:id="rId12"/>
+      <w:footerReference w:type="default" r:id="rId13"/>
       <w:pgSz w:w="11906" w:h="16838"/>
       <w:pgMar w:top="1531" w:right="1247" w:bottom="1304" w:left="1247" w:header="680" w:footer="624" w:gutter="0"/>
       <w:cols w:space="720"/>
@@ -3791,6 +3791,31 @@
     </w:sectPr>
   </w:body>
 </w:document>
+</file>
+
+<file path=word/endnotes.xml><?xml version="1.0" encoding="utf-8"?>
+<w:endnotes xmlns:wpc="http://schemas.microsoft.com/office/word/2010/wordprocessingCanvas" xmlns:cx="http://schemas.microsoft.com/office/drawing/2014/chartex" xmlns:cx1="http://schemas.microsoft.com/office/drawing/2015/9/8/chartex" xmlns:cx2="http://schemas.microsoft.com/office/drawing/2015/10/21/chartex" xmlns:cx3="http://schemas.microsoft.com/office/drawing/2016/5/9/chartex" xmlns:cx4="http://schemas.microsoft.com/office/drawing/2016/5/10/chartex" xmlns:cx5="http://schemas.microsoft.com/office/drawing/2016/5/11/chartex" xmlns:cx6="http://schemas.microsoft.com/office/drawing/2016/5/12/chartex" xmlns:cx7="http://schemas.microsoft.com/office/drawing/2016/5/13/chartex" xmlns:cx8="http://schemas.microsoft.com/office/drawing/2016/5/14/chartex" xmlns:mc="http://schemas.openxmlformats.org/markup-compatibility/2006" xmlns:aink="http://schemas.microsoft.com/office/drawing/2016/ink" xmlns:am3d="http://schemas.microsoft.com/office/drawing/2017/model3d" xmlns:o="urn:schemas-microsoft-com:office:office" xmlns:oel="http://schemas.microsoft.com/office/2019/extlst" xmlns:r="http://schemas.openxmlformats.org/officeDocument/2006/relationships" xmlns:m="http://schemas.openxmlformats.org/officeDocument/2006/math" xmlns:v="urn:schemas-microsoft-com:vml" xmlns:wp14="http://schemas.microsoft.com/office/word/2010/wordprocessingDrawing" xmlns:wp="http://schemas.openxmlformats.org/drawingml/2006/wordprocessingDrawing" xmlns:w10="urn:schemas-microsoft-com:office:word" xmlns:w="http://schemas.openxmlformats.org/wordprocessingml/2006/main" xmlns:w14="http://schemas.microsoft.com/office/word/2010/wordml" xmlns:w15="http://schemas.microsoft.com/office/word/2012/wordml" xmlns:w16cex="http://schemas.microsoft.com/office/word/2018/wordml/cex" xmlns:w16cid="http://schemas.microsoft.com/office/word/2016/wordml/cid" xmlns:w16="http://schemas.microsoft.com/office/word/2018/wordml" xmlns:w16du="http://schemas.microsoft.com/office/word/2023/wordml/word16du" xmlns:w16sdtdh="http://schemas.microsoft.com/office/word/2020/wordml/sdtdatahash" xmlns:w16se="http://schemas.microsoft.com/office/word/2015/wordml/symex" xmlns:wpg="http://schemas.microsoft.com/office/word/2010/wordprocessingGroup" xmlns:wpi="http://schemas.microsoft.com/office/word/2010/wordprocessingInk" xmlns:wne="http://schemas.microsoft.com/office/word/2006/wordml" xmlns:wps="http://schemas.microsoft.com/office/word/2010/wordprocessingShape" mc:Ignorable="w14 w15 w16se w16cid w16 w16cex w16sdtdh w16du wp14">
+  <w:endnote w:type="separator" w:id="-1">
+    <w:p>
+      <w:pPr>
+        <w:spacing w:after="0" w:line="240" w:lineRule="auto"/>
+      </w:pPr>
+      <w:r>
+        <w:separator/>
+      </w:r>
+    </w:p>
+  </w:endnote>
+  <w:endnote w:type="continuationSeparator" w:id="0">
+    <w:p>
+      <w:pPr>
+        <w:spacing w:after="0" w:line="240" w:lineRule="auto"/>
+      </w:pPr>
+      <w:r>
+        <w:continuationSeparator/>
+      </w:r>
+    </w:p>
+  </w:endnote>
+</w:endnotes>
 </file>
 
 <file path=word/footer1.xml><?xml version="1.0" encoding="utf-8"?>
@@ -3830,23 +3855,38 @@
       </w:rPr>
       <w:t xml:space="preserve"> من </w:t>
     </w:r>
-    <w:r>
-      <w:fldChar w:fldCharType="begin"/>
-    </w:r>
-    <w:r>
-      <w:instrText xml:space="preserve"> NUMPAGES </w:instrText>
-    </w:r>
-    <w:r>
-      <w:fldChar w:fldCharType="separate"/>
-    </w:r>
-    <w:r>
-      <w:t>5</w:t>
-    </w:r>
-    <w:r>
-      <w:fldChar w:fldCharType="end"/>
-    </w:r>
+    <w:fldSimple w:instr=" NUMPAGES ">
+      <w:r>
+        <w:t>5</w:t>
+      </w:r>
+    </w:fldSimple>
   </w:p>
 </w:ftr>
+</file>
+
+<file path=word/footnotes.xml><?xml version="1.0" encoding="utf-8"?>
+<w:footnotes xmlns:wpc="http://schemas.microsoft.com/office/word/2010/wordprocessingCanvas" xmlns:cx="http://schemas.microsoft.com/office/drawing/2014/chartex" xmlns:cx1="http://schemas.microsoft.com/office/drawing/2015/9/8/chartex" xmlns:cx2="http://schemas.microsoft.com/office/drawing/2015/10/21/chartex" xmlns:cx3="http://schemas.microsoft.com/office/drawing/2016/5/9/chartex" xmlns:cx4="http://schemas.microsoft.com/office/drawing/2016/5/10/chartex" xmlns:cx5="http://schemas.microsoft.com/office/drawing/2016/5/11/chartex" xmlns:cx6="http://schemas.microsoft.com/office/drawing/2016/5/12/chartex" xmlns:cx7="http://schemas.microsoft.com/office/drawing/2016/5/13/chartex" xmlns:cx8="http://schemas.microsoft.com/office/drawing/2016/5/14/chartex" xmlns:mc="http://schemas.openxmlformats.org/markup-compatibility/2006" xmlns:aink="http://schemas.microsoft.com/office/drawing/2016/ink" xmlns:am3d="http://schemas.microsoft.com/office/drawing/2017/model3d" xmlns:o="urn:schemas-microsoft-com:office:office" xmlns:oel="http://schemas.microsoft.com/office/2019/extlst" xmlns:r="http://schemas.openxmlformats.org/officeDocument/2006/relationships" xmlns:m="http://schemas.openxmlformats.org/officeDocument/2006/math" xmlns:v="urn:schemas-microsoft-com:vml" xmlns:wp14="http://schemas.microsoft.com/office/word/2010/wordprocessingDrawing" xmlns:wp="http://schemas.openxmlformats.org/drawingml/2006/wordprocessingDrawing" xmlns:w10="urn:schemas-microsoft-com:office:word" xmlns:w="http://schemas.openxmlformats.org/wordprocessingml/2006/main" xmlns:w14="http://schemas.microsoft.com/office/word/2010/wordml" xmlns:w15="http://schemas.microsoft.com/office/word/2012/wordml" xmlns:w16cex="http://schemas.microsoft.com/office/word/2018/wordml/cex" xmlns:w16cid="http://schemas.microsoft.com/office/word/2016/wordml/cid" xmlns:w16="http://schemas.microsoft.com/office/word/2018/wordml" xmlns:w16du="http://schemas.microsoft.com/office/word/2023/wordml/word16du" xmlns:w16sdtdh="http://schemas.microsoft.com/office/word/2020/wordml/sdtdatahash" xmlns:w16se="http://schemas.microsoft.com/office/word/2015/wordml/symex" xmlns:wpg="http://schemas.microsoft.com/office/word/2010/wordprocessingGroup" xmlns:wpi="http://schemas.microsoft.com/office/word/2010/wordprocessingInk" xmlns:wne="http://schemas.microsoft.com/office/word/2006/wordml" xmlns:wps="http://schemas.microsoft.com/office/word/2010/wordprocessingShape" mc:Ignorable="w14 w15 w16se w16cid w16 w16cex w16sdtdh w16du wp14">
+  <w:footnote w:type="separator" w:id="-1">
+    <w:p>
+      <w:pPr>
+        <w:spacing w:after="0" w:line="240" w:lineRule="auto"/>
+      </w:pPr>
+      <w:r>
+        <w:separator/>
+      </w:r>
+    </w:p>
+  </w:footnote>
+  <w:footnote w:type="continuationSeparator" w:id="0">
+    <w:p>
+      <w:pPr>
+        <w:spacing w:after="0" w:line="240" w:lineRule="auto"/>
+      </w:pPr>
+      <w:r>
+        <w:continuationSeparator/>
+      </w:r>
+    </w:p>
+  </w:footnote>
+</w:footnotes>
 </file>
 
 <file path=word/header1.xml><?xml version="1.0" encoding="utf-8"?>

</xml_diff>